<commit_message>
Site updated: 2022-03-10 22:17:57
</commit_message>
<xml_diff>
--- a/treasure/download/经藏/大集部-28部/新建文件夹/百千颂大集经地藏菩萨请问法身赞-唐-不空.docx
+++ b/treasure/download/经藏/大集部-28部/新建文件夹/百千颂大集经地藏菩萨请问法身赞-唐-不空.docx
@@ -219,6 +219,16 @@
         </w:rPr>
         <w:t>如净其烦恼　　法界极清净</w:t>
       </w:r>
+      <w:r>
+        <w:rPr>
+          <w:rFonts w:hint="eastAsia"/>
+          <w:sz w:val="24"/>
+          <w:szCs w:val="24"/>
+          <w:shd w:val="pct15" w:color="auto" w:fill="FFFFFF"/>
+          <w:lang w:eastAsia="zh-CN"/>
+        </w:rPr>
+        <w:t>。</w:t>
+      </w:r>
     </w:p>
     <w:p>
       <w:pPr>
@@ -1063,15 +1073,7 @@
           <w:szCs w:val="24"/>
           <w:shd w:val="pct15" w:color="auto" w:fill="FFFFFF"/>
         </w:rPr>
-        <w:t xml:space="preserve">　</w:t>
-      </w:r>
-      <w:r>
-        <w:rPr>
-          <w:sz w:val="24"/>
-          <w:szCs w:val="24"/>
-          <w:shd w:val="pct15" w:color="auto" w:fill="FFFFFF"/>
-        </w:rPr>
-        <w:t xml:space="preserve">　法界亦非我　　非女亦非男</w:t>
+        <w:t xml:space="preserve">　　法界亦非我　　非女亦非男</w:t>
       </w:r>
       <w:r>
         <w:rPr>
@@ -4361,75 +4363,23 @@
       </w:r>
       <w:r>
         <w:rPr>
-          <w:sz w:val="24"/>
-          <w:szCs w:val="24"/>
-          <w:shd w:val="pct15" w:color="auto" w:fill="FFFFFF"/>
-        </w:rPr>
-        <w:t>[</w:t>
-      </w:r>
-      <w:r>
-        <w:rPr>
-          <w:sz w:val="24"/>
-          <w:szCs w:val="24"/>
-          <w:shd w:val="pct15" w:color="auto" w:fill="FFFFFF"/>
-        </w:rPr>
-        <w:t>穀</w:t>
-      </w:r>
-      <w:r>
-        <w:rPr>
-          <w:sz w:val="24"/>
-          <w:szCs w:val="24"/>
-          <w:shd w:val="pct15" w:color="auto" w:fill="FFFFFF"/>
-        </w:rPr>
-        <w:t>-</w:t>
-      </w:r>
-      <w:r>
-        <w:rPr>
-          <w:sz w:val="24"/>
-          <w:szCs w:val="24"/>
-          <w:shd w:val="pct15" w:color="auto" w:fill="FFFFFF"/>
-        </w:rPr>
-        <w:t>禾</w:t>
-      </w:r>
-      <w:r>
-        <w:rPr>
-          <w:sz w:val="24"/>
-          <w:szCs w:val="24"/>
-          <w:shd w:val="pct15" w:color="auto" w:fill="FFFFFF"/>
-        </w:rPr>
-        <w:t>+</w:t>
-      </w:r>
-      <w:r>
-        <w:rPr>
-          <w:sz w:val="24"/>
-          <w:szCs w:val="24"/>
-          <w:shd w:val="pct15" w:color="auto" w:fill="FFFFFF"/>
-        </w:rPr>
-        <w:t>卵</w:t>
-      </w:r>
-      <w:r>
-        <w:rPr>
-          <w:sz w:val="24"/>
-          <w:szCs w:val="24"/>
-          <w:shd w:val="pct15" w:color="auto" w:fill="FFFFFF"/>
-        </w:rPr>
-        <w:t>]</w:t>
-      </w:r>
-      <w:r>
-        <w:rPr>
-          <w:sz w:val="24"/>
-          <w:szCs w:val="24"/>
-          <w:shd w:val="pct15" w:color="auto" w:fill="FFFFFF"/>
-        </w:rPr>
-        <w:t xml:space="preserve">　　普遍</w:t>
-      </w:r>
-      <w:r>
-        <w:rPr>
-          <w:sz w:val="24"/>
-          <w:szCs w:val="24"/>
-          <w:shd w:val="pct15" w:color="auto" w:fill="FFFFFF"/>
-        </w:rPr>
-        <w:t>皆碎坏</w:t>
+          <w:rFonts w:hint="eastAsia"/>
+          <w:sz w:val="24"/>
+          <w:szCs w:val="24"/>
+          <w:shd w:val="pct15" w:color="auto" w:fill="FFFFFF"/>
+          <w:lang w:eastAsia="zh-CN"/>
+        </w:rPr>
+        <w:t>壳</w:t>
+      </w:r>
+      <w:bookmarkStart w:id="0" w:name="_GoBack"/>
+      <w:bookmarkEnd w:id="0"/>
+      <w:r>
+        <w:rPr>
+          <w:sz w:val="24"/>
+          <w:szCs w:val="24"/>
+          <w:shd w:val="pct15" w:color="auto" w:fill="FFFFFF"/>
+        </w:rPr>
+        <w:t xml:space="preserve">　　普遍皆碎坏</w:t>
       </w:r>
       <w:r>
         <w:rPr>
@@ -5838,43 +5788,25 @@
           <w:szCs w:val="24"/>
           <w:shd w:val="pct15" w:color="auto" w:fill="FFFFFF"/>
         </w:rPr>
-        <w:t xml:space="preserve">　　若有相应显此理　　唯身以慧</w:t>
-      </w:r>
-      <w:r>
-        <w:rPr>
-          <w:sz w:val="24"/>
-          <w:szCs w:val="24"/>
-          <w:shd w:val="pct15" w:color="auto" w:fill="FFFFFF"/>
-        </w:rPr>
-        <w:t>作分析</w:t>
-      </w:r>
-      <w:r>
-        <w:rPr>
-          <w:rFonts w:hint="eastAsia"/>
-          <w:sz w:val="24"/>
-          <w:szCs w:val="24"/>
-          <w:shd w:val="pct15" w:color="auto" w:fill="FFFFFF"/>
-          <w:lang w:eastAsia="zh-CN"/>
-        </w:rPr>
-        <w:t>。</w:t>
-      </w:r>
-      <w:bookmarkStart w:id="0" w:name="_GoBack"/>
-      <w:bookmarkEnd w:id="0"/>
-      <w:r>
-        <w:rPr>
-          <w:sz w:val="24"/>
-          <w:szCs w:val="24"/>
-          <w:shd w:val="pct15" w:color="auto" w:fill="FFFFFF"/>
-        </w:rPr>
-        <w:t>彼人生于净莲花　　闻法所说无</w:t>
-      </w:r>
-      <w:r>
-        <w:rPr>
-          <w:sz w:val="24"/>
-          <w:szCs w:val="24"/>
-          <w:shd w:val="pct15" w:color="auto" w:fill="FFFFFF"/>
-        </w:rPr>
-        <w:t>量寿</w:t>
+        <w:t xml:space="preserve">　　若有相应显此理　　唯身以慧作分析</w:t>
+      </w:r>
+      <w:r>
+        <w:rPr>
+          <w:rFonts w:hint="eastAsia"/>
+          <w:sz w:val="24"/>
+          <w:szCs w:val="24"/>
+          <w:shd w:val="pct15" w:color="auto" w:fill="FFFFFF"/>
+          <w:lang w:eastAsia="zh-CN"/>
+        </w:rPr>
+        <w:t>。</w:t>
+      </w:r>
+      <w:r>
+        <w:rPr>
+          <w:sz w:val="24"/>
+          <w:szCs w:val="24"/>
+          <w:shd w:val="pct15" w:color="auto" w:fill="FFFFFF"/>
+        </w:rPr>
+        <w:t>彼人生于净莲花　　闻法所说无量寿</w:t>
       </w:r>
       <w:r>
         <w:rPr>
@@ -17824,7 +17756,7 @@
 </file>
 
 <file path=customXml/itemProps1.xml><?xml version="1.0" encoding="utf-8"?>
-<ds:datastoreItem xmlns:ds="http://schemas.openxmlformats.org/officeDocument/2006/customXml" ds:itemID="{7D973484-0693-4D91-8645-940D80D0BD7A}">
+<ds:datastoreItem xmlns:ds="http://schemas.openxmlformats.org/officeDocument/2006/customXml" ds:itemID="{CD4294D7-0382-44AD-9302-380ADCB6794E}">
   <ds:schemaRefs>
     <ds:schemaRef ds:uri="http://schemas.openxmlformats.org/officeDocument/2006/bibliography"/>
   </ds:schemaRefs>

</xml_diff>